<commit_message>
feat: implement Spring AOP logging with shipment service
</commit_message>
<xml_diff>
--- a/Backend/AspectOrientedProgramming/MODULE10/notes/AOP.docx
+++ b/Backend/AspectOrientedProgramming/MODULE10/notes/AOP.docx
@@ -48,10 +48,7 @@
         <w:t xml:space="preserve">. </w:t>
       </w:r>
       <w:r>
-        <w:t>Cross-cutting concerns</w:t>
-      </w:r>
-      <w:r>
-        <w:t xml:space="preserve"> are f</w:t>
+        <w:t>Cross-cutting concerns are f</w:t>
       </w:r>
       <w:r>
         <w:t>unctionalities such as logging, security, transaction, caching and exception handling that are used across multiple parts of an application without tangling the code are separated from the core business logic and are commonly implemented using AOP.</w:t>
@@ -226,7 +223,19 @@
         </w:numPr>
       </w:pPr>
       <w:r>
-        <w:t>Logging aspect, securityAspect</w:t>
+        <w:t xml:space="preserve">Logging </w:t>
+      </w:r>
+      <w:r>
+        <w:t>A</w:t>
+      </w:r>
+      <w:r>
+        <w:t xml:space="preserve">spect, </w:t>
+      </w:r>
+      <w:r>
+        <w:t>S</w:t>
+      </w:r>
+      <w:r>
+        <w:t>ecurityAspect</w:t>
       </w:r>
     </w:p>
     <w:p>
@@ -402,24 +411,51 @@
       <w:pPr>
         <w:pStyle w:val="ListParagraph"/>
         <w:numPr>
+          <w:ilvl w:val="0"/>
+          <w:numId w:val="2"/>
+        </w:numPr>
+      </w:pPr>
+      <w:r>
+        <w:t>Pointcut:</w:t>
+      </w:r>
+    </w:p>
+    <w:p>
+      <w:pPr>
+        <w:pStyle w:val="ListParagraph"/>
+        <w:numPr>
           <w:ilvl w:val="1"/>
           <w:numId w:val="2"/>
         </w:numPr>
       </w:pPr>
       <w:r>
-        <w:t>Pointcut</w:t>
-      </w:r>
-    </w:p>
-    <w:p>
-      <w:pPr>
-        <w:pStyle w:val="ListParagraph"/>
-        <w:numPr>
-          <w:ilvl w:val="2"/>
-          <w:numId w:val="2"/>
-        </w:numPr>
-      </w:pPr>
-      <w:r>
-        <w:t>A pointcut defines which Join Points should be intercepted</w:t>
+        <w:t xml:space="preserve">They are expressions that match certain joint points for example, </w:t>
+      </w:r>
+      <w:r>
+        <w:t>@Before("execution(* com.example.service.*.*(..))")</w:t>
+      </w:r>
+    </w:p>
+    <w:p>
+      <w:pPr>
+        <w:pStyle w:val="ListParagraph"/>
+        <w:numPr>
+          <w:ilvl w:val="0"/>
+          <w:numId w:val="2"/>
+        </w:numPr>
+      </w:pPr>
+      <w:r>
+        <w:t>Weaving</w:t>
+      </w:r>
+    </w:p>
+    <w:p>
+      <w:pPr>
+        <w:pStyle w:val="ListParagraph"/>
+        <w:numPr>
+          <w:ilvl w:val="1"/>
+          <w:numId w:val="2"/>
+        </w:numPr>
+      </w:pPr>
+      <w:r>
+        <w:t>Weaving is the process of linking Aspects with the target application objects</w:t>
       </w:r>
     </w:p>
     <w:p/>
@@ -1274,7 +1310,6 @@
   <w:style w:type="character" w:default="1" w:styleId="DefaultParagraphFont">
     <w:name w:val="Default Paragraph Font"/>
     <w:uiPriority w:val="1"/>
-    <w:semiHidden/>
     <w:unhideWhenUsed/>
   </w:style>
   <w:style w:type="table" w:default="1" w:styleId="TableNormal">

</xml_diff>